<commit_message>
He creado mi metodo post, he creado el crearAlquilerDTO, he arrreglado un pequeño error que habia en alquiler item ya que habia un atributo que no hacia falta.
</commit_message>
<xml_diff>
--- a/req/CasosDeUso_grupoA1.docx
+++ b/req/CasosDeUso_grupoA1.docx
@@ -10235,6 +10235,23 @@
         </w:rPr>
         <w:t>alquilar.</w:t>
       </w:r>
+      <w:r>
+        <w:rPr>
+          <w:spacing w:val="-2"/>
+          <w:sz w:val="24"/>
+        </w:rPr>
+        <w:t xml:space="preserve"> </w:t>
+      </w:r>
+      <w:r>
+        <w:rPr>
+          <w:b/>
+          <w:bCs/>
+          <w:color w:val="EE0000"/>
+          <w:spacing w:val="-2"/>
+          <w:sz w:val="24"/>
+        </w:rPr>
+        <w:t>POST</w:t>
+      </w:r>
     </w:p>
     <w:p>
       <w:pPr>
@@ -10568,6 +10585,16 @@
         </w:rPr>
         <w:t>).</w:t>
       </w:r>
+      <w:r>
+        <w:rPr>
+          <w:b/>
+          <w:bCs/>
+          <w:color w:val="EE0000"/>
+          <w:spacing w:val="-2"/>
+          <w:sz w:val="24"/>
+        </w:rPr>
+        <w:t xml:space="preserve"> DETALLE</w:t>
+      </w:r>
     </w:p>
     <w:p>
       <w:pPr>
@@ -11382,6 +11409,29 @@
         </w:rPr>
         <w:t xml:space="preserve">filtros. </w:t>
       </w:r>
+      <w:r>
+        <w:rPr>
+          <w:b/>
+          <w:bCs/>
+          <w:color w:val="EE0000"/>
+          <w:sz w:val="24"/>
+        </w:rPr>
+        <w:t>GET</w:t>
+      </w:r>
+    </w:p>
+    <w:p>
+      <w:pPr>
+        <w:pStyle w:val="Prrafodelista"/>
+        <w:tabs>
+          <w:tab w:val="left" w:pos="360"/>
+        </w:tabs>
+        <w:spacing w:before="7" w:line="470" w:lineRule="atLeast"/>
+        <w:ind w:right="488"/>
+        <w:jc w:val="left"/>
+        <w:rPr>
+          <w:sz w:val="24"/>
+        </w:rPr>
+      </w:pPr>
       <w:r>
         <w:rPr>
           <w:color w:val="006FC0"/>
@@ -13087,13 +13137,7 @@
                             <w:rPr>
                               <w:spacing w:val="-2"/>
                             </w:rPr>
-                            <w:t xml:space="preserve">  </w:t>
-                          </w:r>
-                          <w:r>
-                            <w:rPr>
-                              <w:spacing w:val="-2"/>
-                            </w:rPr>
-                            <w:t>Martín Álvarez Castillo</w:t>
+                            <w:t xml:space="preserve">  Martín Álvarez Castillo</w:t>
                           </w:r>
                         </w:p>
                         <w:p>
@@ -13263,13 +13307,7 @@
                       <w:rPr>
                         <w:spacing w:val="-2"/>
                       </w:rPr>
-                      <w:t xml:space="preserve">  </w:t>
-                    </w:r>
-                    <w:r>
-                      <w:rPr>
-                        <w:spacing w:val="-2"/>
-                      </w:rPr>
-                      <w:t>Martín Álvarez Castillo</w:t>
+                      <w:t xml:space="preserve">  Martín Álvarez Castillo</w:t>
                     </w:r>
                   </w:p>
                   <w:p>
@@ -13743,13 +13781,7 @@
                             <w:rPr>
                               <w:spacing w:val="-2"/>
                             </w:rPr>
-                            <w:t xml:space="preserve">  </w:t>
-                          </w:r>
-                          <w:r>
-                            <w:rPr>
-                              <w:spacing w:val="-2"/>
-                            </w:rPr>
-                            <w:t>Álvaro Cano Andrés</w:t>
+                            <w:t xml:space="preserve">  Álvaro Cano Andrés</w:t>
                           </w:r>
                         </w:p>
                         <w:p>
@@ -13903,13 +13935,7 @@
                       <w:rPr>
                         <w:spacing w:val="-2"/>
                       </w:rPr>
-                      <w:t xml:space="preserve">  </w:t>
-                    </w:r>
-                    <w:r>
-                      <w:rPr>
-                        <w:spacing w:val="-2"/>
-                      </w:rPr>
-                      <w:t>Álvaro Cano Andrés</w:t>
+                      <w:t xml:space="preserve">  Álvaro Cano Andrés</w:t>
                     </w:r>
                   </w:p>
                   <w:p>
@@ -14438,13 +14464,7 @@
                             <w:rPr>
                               <w:spacing w:val="-2"/>
                             </w:rPr>
-                            <w:t xml:space="preserve">  </w:t>
-                          </w:r>
-                          <w:r>
-                            <w:rPr>
-                              <w:spacing w:val="-2"/>
-                            </w:rPr>
-                            <w:t>Daniel de la Cruz Torrijos</w:t>
+                            <w:t xml:space="preserve">  Daniel de la Cruz Torrijos</w:t>
                           </w:r>
                         </w:p>
                         <w:p>
@@ -14606,13 +14626,7 @@
                       <w:rPr>
                         <w:spacing w:val="-2"/>
                       </w:rPr>
-                      <w:t xml:space="preserve">  </w:t>
-                    </w:r>
-                    <w:r>
-                      <w:rPr>
-                        <w:spacing w:val="-2"/>
-                      </w:rPr>
-                      <w:t>Daniel de la Cruz Torrijos</w:t>
+                      <w:t xml:space="preserve">  Daniel de la Cruz Torrijos</w:t>
                     </w:r>
                   </w:p>
                   <w:p>

</xml_diff>

<commit_message>
He creado mi metodo post, he creado el crearAlquilerDTO, he arrreglado un pequeño error que habia en alquiler item ya que habia un atributo que no hacia falta. (#135)
</commit_message>
<xml_diff>
--- a/req/CasosDeUso_grupoA1.docx
+++ b/req/CasosDeUso_grupoA1.docx
@@ -10235,6 +10235,23 @@
         </w:rPr>
         <w:t>alquilar.</w:t>
       </w:r>
+      <w:r>
+        <w:rPr>
+          <w:spacing w:val="-2"/>
+          <w:sz w:val="24"/>
+        </w:rPr>
+        <w:t xml:space="preserve"> </w:t>
+      </w:r>
+      <w:r>
+        <w:rPr>
+          <w:b/>
+          <w:bCs/>
+          <w:color w:val="EE0000"/>
+          <w:spacing w:val="-2"/>
+          <w:sz w:val="24"/>
+        </w:rPr>
+        <w:t>POST</w:t>
+      </w:r>
     </w:p>
     <w:p>
       <w:pPr>
@@ -10568,6 +10585,16 @@
         </w:rPr>
         <w:t>).</w:t>
       </w:r>
+      <w:r>
+        <w:rPr>
+          <w:b/>
+          <w:bCs/>
+          <w:color w:val="EE0000"/>
+          <w:spacing w:val="-2"/>
+          <w:sz w:val="24"/>
+        </w:rPr>
+        <w:t xml:space="preserve"> DETALLE</w:t>
+      </w:r>
     </w:p>
     <w:p>
       <w:pPr>
@@ -11382,6 +11409,29 @@
         </w:rPr>
         <w:t xml:space="preserve">filtros. </w:t>
       </w:r>
+      <w:r>
+        <w:rPr>
+          <w:b/>
+          <w:bCs/>
+          <w:color w:val="EE0000"/>
+          <w:sz w:val="24"/>
+        </w:rPr>
+        <w:t>GET</w:t>
+      </w:r>
+    </w:p>
+    <w:p>
+      <w:pPr>
+        <w:pStyle w:val="Prrafodelista"/>
+        <w:tabs>
+          <w:tab w:val="left" w:pos="360"/>
+        </w:tabs>
+        <w:spacing w:before="7" w:line="470" w:lineRule="atLeast"/>
+        <w:ind w:right="488"/>
+        <w:jc w:val="left"/>
+        <w:rPr>
+          <w:sz w:val="24"/>
+        </w:rPr>
+      </w:pPr>
       <w:r>
         <w:rPr>
           <w:color w:val="006FC0"/>
@@ -13087,13 +13137,7 @@
                             <w:rPr>
                               <w:spacing w:val="-2"/>
                             </w:rPr>
-                            <w:t xml:space="preserve">  </w:t>
-                          </w:r>
-                          <w:r>
-                            <w:rPr>
-                              <w:spacing w:val="-2"/>
-                            </w:rPr>
-                            <w:t>Martín Álvarez Castillo</w:t>
+                            <w:t xml:space="preserve">  Martín Álvarez Castillo</w:t>
                           </w:r>
                         </w:p>
                         <w:p>
@@ -13263,13 +13307,7 @@
                       <w:rPr>
                         <w:spacing w:val="-2"/>
                       </w:rPr>
-                      <w:t xml:space="preserve">  </w:t>
-                    </w:r>
-                    <w:r>
-                      <w:rPr>
-                        <w:spacing w:val="-2"/>
-                      </w:rPr>
-                      <w:t>Martín Álvarez Castillo</w:t>
+                      <w:t xml:space="preserve">  Martín Álvarez Castillo</w:t>
                     </w:r>
                   </w:p>
                   <w:p>
@@ -13743,13 +13781,7 @@
                             <w:rPr>
                               <w:spacing w:val="-2"/>
                             </w:rPr>
-                            <w:t xml:space="preserve">  </w:t>
-                          </w:r>
-                          <w:r>
-                            <w:rPr>
-                              <w:spacing w:val="-2"/>
-                            </w:rPr>
-                            <w:t>Álvaro Cano Andrés</w:t>
+                            <w:t xml:space="preserve">  Álvaro Cano Andrés</w:t>
                           </w:r>
                         </w:p>
                         <w:p>
@@ -13903,13 +13935,7 @@
                       <w:rPr>
                         <w:spacing w:val="-2"/>
                       </w:rPr>
-                      <w:t xml:space="preserve">  </w:t>
-                    </w:r>
-                    <w:r>
-                      <w:rPr>
-                        <w:spacing w:val="-2"/>
-                      </w:rPr>
-                      <w:t>Álvaro Cano Andrés</w:t>
+                      <w:t xml:space="preserve">  Álvaro Cano Andrés</w:t>
                     </w:r>
                   </w:p>
                   <w:p>
@@ -14438,13 +14464,7 @@
                             <w:rPr>
                               <w:spacing w:val="-2"/>
                             </w:rPr>
-                            <w:t xml:space="preserve">  </w:t>
-                          </w:r>
-                          <w:r>
-                            <w:rPr>
-                              <w:spacing w:val="-2"/>
-                            </w:rPr>
-                            <w:t>Daniel de la Cruz Torrijos</w:t>
+                            <w:t xml:space="preserve">  Daniel de la Cruz Torrijos</w:t>
                           </w:r>
                         </w:p>
                         <w:p>
@@ -14606,13 +14626,7 @@
                       <w:rPr>
                         <w:spacing w:val="-2"/>
                       </w:rPr>
-                      <w:t xml:space="preserve">  </w:t>
-                    </w:r>
-                    <w:r>
-                      <w:rPr>
-                        <w:spacing w:val="-2"/>
-                      </w:rPr>
-                      <w:t>Daniel de la Cruz Torrijos</w:t>
+                      <w:t xml:space="preserve">  Daniel de la Cruz Torrijos</w:t>
                     </w:r>
                   </w:p>
                   <w:p>

</xml_diff>